<commit_message>
Added microcontroller code and updated specs, info.
</commit_message>
<xml_diff>
--- a/specs.docx
+++ b/specs.docx
@@ -1,6 +1,6 @@
 
 <file path=word/document.xml><?xml version="1.0" encoding="utf-8"?>
-<w:document xmlns:wpc="http://schemas.microsoft.com/office/word/2010/wordprocessingCanvas" xmlns:cx="http://schemas.microsoft.com/office/drawing/2014/chartex" xmlns:cx1="http://schemas.microsoft.com/office/drawing/2015/9/8/chartex" xmlns:cx2="http://schemas.microsoft.com/office/drawing/2015/10/21/chartex" xmlns:cx3="http://schemas.microsoft.com/office/drawing/2016/5/9/chartex" xmlns:cx4="http://schemas.microsoft.com/office/drawing/2016/5/10/chartex" xmlns:cx5="http://schemas.microsoft.com/office/drawing/2016/5/11/chartex" xmlns:cx6="http://schemas.microsoft.com/office/drawing/2016/5/12/chartex" xmlns:cx7="http://schemas.microsoft.com/office/drawing/2016/5/13/chartex" xmlns:cx8="http://schemas.microsoft.com/office/drawing/2016/5/14/chartex" xmlns:mc="http://schemas.openxmlformats.org/markup-compatibility/2006" xmlns:aink="http://schemas.microsoft.com/office/drawing/2016/ink" xmlns:am3d="http://schemas.microsoft.com/office/drawing/2017/model3d" xmlns:o="urn:schemas-microsoft-com:office:office" xmlns:r="http://schemas.openxmlformats.org/officeDocument/2006/relationships" xmlns:m="http://schemas.openxmlformats.org/officeDocument/2006/math" xmlns:v="urn:schemas-microsoft-com:vml" xmlns:wp14="http://schemas.microsoft.com/office/word/2010/wordprocessingDrawing" xmlns:wp="http://schemas.openxmlformats.org/drawingml/2006/wordprocessingDrawing" xmlns:w10="urn:schemas-microsoft-com:office:word" xmlns:w="http://schemas.openxmlformats.org/wordprocessingml/2006/main" xmlns:w14="http://schemas.microsoft.com/office/word/2010/wordml" xmlns:w15="http://schemas.microsoft.com/office/word/2012/wordml" xmlns:w16cex="http://schemas.microsoft.com/office/word/2018/wordml/cex" xmlns:w16cid="http://schemas.microsoft.com/office/word/2016/wordml/cid" xmlns:w16="http://schemas.microsoft.com/office/word/2018/wordml" xmlns:w16sdtdh="http://schemas.microsoft.com/office/word/2020/wordml/sdtdatahash" xmlns:w16se="http://schemas.microsoft.com/office/word/2015/wordml/symex" xmlns:wpg="http://schemas.microsoft.com/office/word/2010/wordprocessingGroup" xmlns:wpi="http://schemas.microsoft.com/office/word/2010/wordprocessingInk" xmlns:wne="http://schemas.microsoft.com/office/word/2006/wordml" xmlns:wps="http://schemas.microsoft.com/office/word/2010/wordprocessingShape" mc:Ignorable="w14 w15 w16se w16cid w16 w16cex w16sdtdh wp14">
+<w:document xmlns:wpc="http://schemas.microsoft.com/office/word/2010/wordprocessingCanvas" xmlns:cx="http://schemas.microsoft.com/office/drawing/2014/chartex" xmlns:cx1="http://schemas.microsoft.com/office/drawing/2015/9/8/chartex" xmlns:cx2="http://schemas.microsoft.com/office/drawing/2015/10/21/chartex" xmlns:cx3="http://schemas.microsoft.com/office/drawing/2016/5/9/chartex" xmlns:cx4="http://schemas.microsoft.com/office/drawing/2016/5/10/chartex" xmlns:cx5="http://schemas.microsoft.com/office/drawing/2016/5/11/chartex" xmlns:cx6="http://schemas.microsoft.com/office/drawing/2016/5/12/chartex" xmlns:cx7="http://schemas.microsoft.com/office/drawing/2016/5/13/chartex" xmlns:cx8="http://schemas.microsoft.com/office/drawing/2016/5/14/chartex" xmlns:mc="http://schemas.openxmlformats.org/markup-compatibility/2006" xmlns:aink="http://schemas.microsoft.com/office/drawing/2016/ink" xmlns:am3d="http://schemas.microsoft.com/office/drawing/2017/model3d" xmlns:o="urn:schemas-microsoft-com:office:office" xmlns:oel="http://schemas.microsoft.com/office/2019/extlst" xmlns:r="http://schemas.openxmlformats.org/officeDocument/2006/relationships" xmlns:m="http://schemas.openxmlformats.org/officeDocument/2006/math" xmlns:v="urn:schemas-microsoft-com:vml" xmlns:wp14="http://schemas.microsoft.com/office/word/2010/wordprocessingDrawing" xmlns:wp="http://schemas.openxmlformats.org/drawingml/2006/wordprocessingDrawing" xmlns:w10="urn:schemas-microsoft-com:office:word" xmlns:w="http://schemas.openxmlformats.org/wordprocessingml/2006/main" xmlns:w14="http://schemas.microsoft.com/office/word/2010/wordml" xmlns:w15="http://schemas.microsoft.com/office/word/2012/wordml" xmlns:w16cex="http://schemas.microsoft.com/office/word/2018/wordml/cex" xmlns:w16cid="http://schemas.microsoft.com/office/word/2016/wordml/cid" xmlns:w16="http://schemas.microsoft.com/office/word/2018/wordml" xmlns:w16du="http://schemas.microsoft.com/office/word/2023/wordml/word16du" xmlns:w16sdtdh="http://schemas.microsoft.com/office/word/2020/wordml/sdtdatahash" xmlns:w16sdtfl="http://schemas.microsoft.com/office/word/2024/wordml/sdtformatlock" xmlns:w16se="http://schemas.microsoft.com/office/word/2015/wordml/symex" xmlns:wpg="http://schemas.microsoft.com/office/word/2010/wordprocessingGroup" xmlns:wpi="http://schemas.microsoft.com/office/word/2010/wordprocessingInk" xmlns:wne="http://schemas.microsoft.com/office/word/2006/wordml" xmlns:wps="http://schemas.microsoft.com/office/word/2010/wordprocessingShape" mc:Ignorable="w14 w15 w16se w16cid w16 w16cex w16sdtdh w16sdtfl w16du wp14">
   <w:body>
     <w:p>
       <w:pPr>
@@ -885,7 +885,13 @@
         <w:rPr>
           <w:rStyle w:val="eop"/>
         </w:rPr>
-        <w:t>Robota roka kontrolējama ar IR sensoru</w:t>
+        <w:t xml:space="preserve">Robota roka kontrolējama ar </w:t>
+      </w:r>
+      <w:r>
+        <w:rPr>
+          <w:rStyle w:val="eop"/>
+        </w:rPr>
+        <w:t>ESP32 Wi-Fi serveri un Arduino Nano.</w:t>
       </w:r>
     </w:p>
     <w:p>
@@ -903,7 +909,19 @@
         <w:rPr>
           <w:rStyle w:val="eop"/>
         </w:rPr>
-        <w:t>4 servo, rotacijai, 2 rokas dalam un 1 spilem</w:t>
+        <w:t xml:space="preserve">4 servo, rotacijai, </w:t>
+      </w:r>
+      <w:r>
+        <w:rPr>
+          <w:rStyle w:val="eop"/>
+        </w:rPr>
+        <w:t>2</w:t>
+      </w:r>
+      <w:r>
+        <w:rPr>
+          <w:rStyle w:val="eop"/>
+        </w:rPr>
+        <w:t xml:space="preserve"> rokas dalam un 1 spilem</w:t>
       </w:r>
     </w:p>
     <w:p>
@@ -943,7 +961,7 @@
 </file>
 
 <file path=word/numbering.xml><?xml version="1.0" encoding="utf-8"?>
-<w:numbering xmlns:wpc="http://schemas.microsoft.com/office/word/2010/wordprocessingCanvas" xmlns:cx="http://schemas.microsoft.com/office/drawing/2014/chartex" xmlns:cx1="http://schemas.microsoft.com/office/drawing/2015/9/8/chartex" xmlns:cx2="http://schemas.microsoft.com/office/drawing/2015/10/21/chartex" xmlns:cx3="http://schemas.microsoft.com/office/drawing/2016/5/9/chartex" xmlns:cx4="http://schemas.microsoft.com/office/drawing/2016/5/10/chartex" xmlns:cx5="http://schemas.microsoft.com/office/drawing/2016/5/11/chartex" xmlns:cx6="http://schemas.microsoft.com/office/drawing/2016/5/12/chartex" xmlns:cx7="http://schemas.microsoft.com/office/drawing/2016/5/13/chartex" xmlns:cx8="http://schemas.microsoft.com/office/drawing/2016/5/14/chartex" xmlns:mc="http://schemas.openxmlformats.org/markup-compatibility/2006" xmlns:aink="http://schemas.microsoft.com/office/drawing/2016/ink" xmlns:am3d="http://schemas.microsoft.com/office/drawing/2017/model3d" xmlns:o="urn:schemas-microsoft-com:office:office" xmlns:r="http://schemas.openxmlformats.org/officeDocument/2006/relationships" xmlns:m="http://schemas.openxmlformats.org/officeDocument/2006/math" xmlns:v="urn:schemas-microsoft-com:vml" xmlns:wp14="http://schemas.microsoft.com/office/word/2010/wordprocessingDrawing" xmlns:wp="http://schemas.openxmlformats.org/drawingml/2006/wordprocessingDrawing" xmlns:w10="urn:schemas-microsoft-com:office:word" xmlns:w="http://schemas.openxmlformats.org/wordprocessingml/2006/main" xmlns:w14="http://schemas.microsoft.com/office/word/2010/wordml" xmlns:w15="http://schemas.microsoft.com/office/word/2012/wordml" xmlns:w16cex="http://schemas.microsoft.com/office/word/2018/wordml/cex" xmlns:w16cid="http://schemas.microsoft.com/office/word/2016/wordml/cid" xmlns:w16="http://schemas.microsoft.com/office/word/2018/wordml" xmlns:w16sdtdh="http://schemas.microsoft.com/office/word/2020/wordml/sdtdatahash" xmlns:w16se="http://schemas.microsoft.com/office/word/2015/wordml/symex" xmlns:wpg="http://schemas.microsoft.com/office/word/2010/wordprocessingGroup" xmlns:wpi="http://schemas.microsoft.com/office/word/2010/wordprocessingInk" xmlns:wne="http://schemas.microsoft.com/office/word/2006/wordml" xmlns:wps="http://schemas.microsoft.com/office/word/2010/wordprocessingShape" mc:Ignorable="w14 w15 w16se w16cid w16 w16cex w16sdtdh wp14">
+<w:numbering xmlns:wpc="http://schemas.microsoft.com/office/word/2010/wordprocessingCanvas" xmlns:cx="http://schemas.microsoft.com/office/drawing/2014/chartex" xmlns:cx1="http://schemas.microsoft.com/office/drawing/2015/9/8/chartex" xmlns:cx2="http://schemas.microsoft.com/office/drawing/2015/10/21/chartex" xmlns:cx3="http://schemas.microsoft.com/office/drawing/2016/5/9/chartex" xmlns:cx4="http://schemas.microsoft.com/office/drawing/2016/5/10/chartex" xmlns:cx5="http://schemas.microsoft.com/office/drawing/2016/5/11/chartex" xmlns:cx6="http://schemas.microsoft.com/office/drawing/2016/5/12/chartex" xmlns:cx7="http://schemas.microsoft.com/office/drawing/2016/5/13/chartex" xmlns:cx8="http://schemas.microsoft.com/office/drawing/2016/5/14/chartex" xmlns:mc="http://schemas.openxmlformats.org/markup-compatibility/2006" xmlns:aink="http://schemas.microsoft.com/office/drawing/2016/ink" xmlns:am3d="http://schemas.microsoft.com/office/drawing/2017/model3d" xmlns:o="urn:schemas-microsoft-com:office:office" xmlns:oel="http://schemas.microsoft.com/office/2019/extlst" xmlns:r="http://schemas.openxmlformats.org/officeDocument/2006/relationships" xmlns:m="http://schemas.openxmlformats.org/officeDocument/2006/math" xmlns:v="urn:schemas-microsoft-com:vml" xmlns:wp14="http://schemas.microsoft.com/office/word/2010/wordprocessingDrawing" xmlns:wp="http://schemas.openxmlformats.org/drawingml/2006/wordprocessingDrawing" xmlns:w10="urn:schemas-microsoft-com:office:word" xmlns:w="http://schemas.openxmlformats.org/wordprocessingml/2006/main" xmlns:w14="http://schemas.microsoft.com/office/word/2010/wordml" xmlns:w15="http://schemas.microsoft.com/office/word/2012/wordml" xmlns:w16cex="http://schemas.microsoft.com/office/word/2018/wordml/cex" xmlns:w16cid="http://schemas.microsoft.com/office/word/2016/wordml/cid" xmlns:w16="http://schemas.microsoft.com/office/word/2018/wordml" xmlns:w16du="http://schemas.microsoft.com/office/word/2023/wordml/word16du" xmlns:w16sdtdh="http://schemas.microsoft.com/office/word/2020/wordml/sdtdatahash" xmlns:w16sdtfl="http://schemas.microsoft.com/office/word/2024/wordml/sdtformatlock" xmlns:w16se="http://schemas.microsoft.com/office/word/2015/wordml/symex" xmlns:wpg="http://schemas.microsoft.com/office/word/2010/wordprocessingGroup" xmlns:wpi="http://schemas.microsoft.com/office/word/2010/wordprocessingInk" xmlns:wne="http://schemas.microsoft.com/office/word/2006/wordml" xmlns:wps="http://schemas.microsoft.com/office/word/2010/wordprocessingShape" mc:Ignorable="w14 w15 w16se w16cid w16 w16cex w16sdtdh w16sdtfl w16du wp14">
   <w:abstractNum w:abstractNumId="0" w15:restartNumberingAfterBreak="0">
     <w:nsid w:val="039F2CB1"/>
     <w:multiLevelType w:val="multilevel"/>
@@ -3317,74 +3335,74 @@
       </w:pPr>
     </w:lvl>
   </w:abstractNum>
-  <w:num w:numId="1">
+  <w:num w:numId="1" w16cid:durableId="439032754">
     <w:abstractNumId w:val="9"/>
   </w:num>
-  <w:num w:numId="2">
+  <w:num w:numId="2" w16cid:durableId="116336256">
     <w:abstractNumId w:val="10"/>
   </w:num>
-  <w:num w:numId="3">
+  <w:num w:numId="3" w16cid:durableId="847602335">
     <w:abstractNumId w:val="19"/>
   </w:num>
-  <w:num w:numId="4">
+  <w:num w:numId="4" w16cid:durableId="1045639079">
     <w:abstractNumId w:val="3"/>
   </w:num>
-  <w:num w:numId="5">
+  <w:num w:numId="5" w16cid:durableId="409811595">
     <w:abstractNumId w:val="18"/>
   </w:num>
-  <w:num w:numId="6">
+  <w:num w:numId="6" w16cid:durableId="756370753">
     <w:abstractNumId w:val="8"/>
   </w:num>
-  <w:num w:numId="7">
+  <w:num w:numId="7" w16cid:durableId="756026281">
     <w:abstractNumId w:val="16"/>
   </w:num>
-  <w:num w:numId="8">
+  <w:num w:numId="8" w16cid:durableId="1113356935">
     <w:abstractNumId w:val="0"/>
   </w:num>
-  <w:num w:numId="9">
+  <w:num w:numId="9" w16cid:durableId="1754164324">
     <w:abstractNumId w:val="2"/>
   </w:num>
-  <w:num w:numId="10">
+  <w:num w:numId="10" w16cid:durableId="89012684">
     <w:abstractNumId w:val="12"/>
   </w:num>
-  <w:num w:numId="11">
+  <w:num w:numId="11" w16cid:durableId="744885287">
     <w:abstractNumId w:val="7"/>
   </w:num>
-  <w:num w:numId="12">
+  <w:num w:numId="12" w16cid:durableId="1823505057">
     <w:abstractNumId w:val="11"/>
   </w:num>
-  <w:num w:numId="13">
+  <w:num w:numId="13" w16cid:durableId="1151365534">
     <w:abstractNumId w:val="1"/>
   </w:num>
-  <w:num w:numId="14">
+  <w:num w:numId="14" w16cid:durableId="318071462">
     <w:abstractNumId w:val="20"/>
   </w:num>
-  <w:num w:numId="15">
+  <w:num w:numId="15" w16cid:durableId="338697961">
     <w:abstractNumId w:val="13"/>
   </w:num>
-  <w:num w:numId="16">
+  <w:num w:numId="16" w16cid:durableId="454758743">
     <w:abstractNumId w:val="17"/>
   </w:num>
-  <w:num w:numId="17">
+  <w:num w:numId="17" w16cid:durableId="1373387177">
     <w:abstractNumId w:val="6"/>
   </w:num>
-  <w:num w:numId="18">
+  <w:num w:numId="18" w16cid:durableId="1570143782">
     <w:abstractNumId w:val="4"/>
   </w:num>
-  <w:num w:numId="19">
+  <w:num w:numId="19" w16cid:durableId="1493831400">
     <w:abstractNumId w:val="14"/>
   </w:num>
-  <w:num w:numId="20">
+  <w:num w:numId="20" w16cid:durableId="577060665">
     <w:abstractNumId w:val="5"/>
   </w:num>
-  <w:num w:numId="21">
+  <w:num w:numId="21" w16cid:durableId="981540204">
     <w:abstractNumId w:val="15"/>
   </w:num>
 </w:numbering>
 </file>
 
 <file path=word/styles.xml><?xml version="1.0" encoding="utf-8"?>
-<w:styles xmlns:mc="http://schemas.openxmlformats.org/markup-compatibility/2006" xmlns:r="http://schemas.openxmlformats.org/officeDocument/2006/relationships" xmlns:w="http://schemas.openxmlformats.org/wordprocessingml/2006/main" xmlns:w14="http://schemas.microsoft.com/office/word/2010/wordml" xmlns:w15="http://schemas.microsoft.com/office/word/2012/wordml" xmlns:w16cex="http://schemas.microsoft.com/office/word/2018/wordml/cex" xmlns:w16cid="http://schemas.microsoft.com/office/word/2016/wordml/cid" xmlns:w16="http://schemas.microsoft.com/office/word/2018/wordml" xmlns:w16sdtdh="http://schemas.microsoft.com/office/word/2020/wordml/sdtdatahash" xmlns:w16se="http://schemas.microsoft.com/office/word/2015/wordml/symex" mc:Ignorable="w14 w15 w16se w16cid w16 w16cex w16sdtdh">
+<w:styles xmlns:mc="http://schemas.openxmlformats.org/markup-compatibility/2006" xmlns:r="http://schemas.openxmlformats.org/officeDocument/2006/relationships" xmlns:w="http://schemas.openxmlformats.org/wordprocessingml/2006/main" xmlns:w14="http://schemas.microsoft.com/office/word/2010/wordml" xmlns:w15="http://schemas.microsoft.com/office/word/2012/wordml" xmlns:w16cex="http://schemas.microsoft.com/office/word/2018/wordml/cex" xmlns:w16cid="http://schemas.microsoft.com/office/word/2016/wordml/cid" xmlns:w16="http://schemas.microsoft.com/office/word/2018/wordml" xmlns:w16du="http://schemas.microsoft.com/office/word/2023/wordml/word16du" xmlns:w16sdtdh="http://schemas.microsoft.com/office/word/2020/wordml/sdtdatahash" xmlns:w16sdtfl="http://schemas.microsoft.com/office/word/2024/wordml/sdtformatlock" xmlns:w16se="http://schemas.microsoft.com/office/word/2015/wordml/symex" mc:Ignorable="w14 w15 w16se w16cid w16 w16cex w16sdtdh w16sdtfl w16du">
   <w:docDefaults>
     <w:rPrDefault>
       <w:rPr>
@@ -3778,17 +3796,17 @@
     <w:lsdException w:name="Unresolved Mention" w:semiHidden="1" w:unhideWhenUsed="1"/>
     <w:lsdException w:name="Smart Link" w:semiHidden="1" w:unhideWhenUsed="1"/>
   </w:latentStyles>
-  <w:style w:type="paragraph" w:default="1" w:styleId="Parasts">
+  <w:style w:type="paragraph" w:default="1" w:styleId="Normal">
     <w:name w:val="Normal"/>
     <w:qFormat/>
   </w:style>
-  <w:style w:type="character" w:default="1" w:styleId="Noklusjumarindkopasfonts">
+  <w:style w:type="character" w:default="1" w:styleId="DefaultParagraphFont">
     <w:name w:val="Default Paragraph Font"/>
     <w:uiPriority w:val="1"/>
     <w:semiHidden/>
     <w:unhideWhenUsed/>
   </w:style>
-  <w:style w:type="table" w:default="1" w:styleId="Parastatabula">
+  <w:style w:type="table" w:default="1" w:styleId="TableNormal">
     <w:name w:val="Normal Table"/>
     <w:uiPriority w:val="99"/>
     <w:semiHidden/>
@@ -3803,7 +3821,7 @@
       </w:tblCellMar>
     </w:tblPr>
   </w:style>
-  <w:style w:type="numbering" w:default="1" w:styleId="Bezsaraksta">
+  <w:style w:type="numbering" w:default="1" w:styleId="NoList">
     <w:name w:val="No List"/>
     <w:uiPriority w:val="99"/>
     <w:semiHidden/>
@@ -3811,7 +3829,7 @@
   </w:style>
   <w:style w:type="paragraph" w:customStyle="1" w:styleId="paragraph">
     <w:name w:val="paragraph"/>
-    <w:basedOn w:val="Parasts"/>
+    <w:basedOn w:val="Normal"/>
     <w:rsid w:val="00556632"/>
     <w:pPr>
       <w:spacing w:before="100" w:beforeAutospacing="1" w:after="100" w:afterAutospacing="1" w:line="240" w:lineRule="auto"/>
@@ -3825,17 +3843,17 @@
   </w:style>
   <w:style w:type="character" w:customStyle="1" w:styleId="normaltextrun">
     <w:name w:val="normaltextrun"/>
-    <w:basedOn w:val="Noklusjumarindkopasfonts"/>
+    <w:basedOn w:val="DefaultParagraphFont"/>
     <w:rsid w:val="00556632"/>
   </w:style>
   <w:style w:type="character" w:customStyle="1" w:styleId="eop">
     <w:name w:val="eop"/>
-    <w:basedOn w:val="Noklusjumarindkopasfonts"/>
+    <w:basedOn w:val="DefaultParagraphFont"/>
     <w:rsid w:val="00556632"/>
   </w:style>
   <w:style w:type="character" w:customStyle="1" w:styleId="scxw82293702">
     <w:name w:val="scxw82293702"/>
-    <w:basedOn w:val="Noklusjumarindkopasfonts"/>
+    <w:basedOn w:val="DefaultParagraphFont"/>
     <w:rsid w:val="00556632"/>
   </w:style>
 </w:styles>

</xml_diff>